<commit_message>
Added Songs, cleaned some verse numbering
</commit_message>
<xml_diff>
--- a/Update Workflow.docx
+++ b/Update Workflow.docx
@@ -78,6 +78,54 @@
       <w:pPr>
         <w:pStyle w:val="ListParagraph"/>
         <w:numPr>
+          <w:ilvl w:val="1"/>
+          <w:numId w:val="2"/>
+        </w:numPr>
+      </w:pPr>
+      <w:r>
+        <w:t>Where am I at right now?</w:t>
+      </w:r>
+    </w:p>
+    <w:p>
+      <w:pPr>
+        <w:pStyle w:val="ListParagraph"/>
+        <w:numPr>
+          <w:ilvl w:val="2"/>
+          <w:numId w:val="2"/>
+        </w:numPr>
+      </w:pPr>
+      <w:r>
+        <w:t>Which branch?</w:t>
+      </w:r>
+    </w:p>
+    <w:p>
+      <w:pPr>
+        <w:pStyle w:val="ListParagraph"/>
+        <w:numPr>
+          <w:ilvl w:val="2"/>
+          <w:numId w:val="2"/>
+        </w:numPr>
+      </w:pPr>
+      <w:r>
+        <w:t>Changes since last commit</w:t>
+      </w:r>
+    </w:p>
+    <w:p>
+      <w:pPr>
+        <w:pStyle w:val="ListParagraph"/>
+        <w:numPr>
+          <w:ilvl w:val="2"/>
+          <w:numId w:val="2"/>
+        </w:numPr>
+      </w:pPr>
+      <w:r>
+        <w:t>What is staged and ready to commit</w:t>
+      </w:r>
+    </w:p>
+    <w:p>
+      <w:pPr>
+        <w:pStyle w:val="ListParagraph"/>
+        <w:numPr>
           <w:ilvl w:val="0"/>
           <w:numId w:val="2"/>
         </w:numPr>
@@ -90,6 +138,18 @@
       <w:pPr>
         <w:pStyle w:val="ListParagraph"/>
         <w:numPr>
+          <w:ilvl w:val="1"/>
+          <w:numId w:val="2"/>
+        </w:numPr>
+      </w:pPr>
+      <w:r>
+        <w:t>. = everything</w:t>
+      </w:r>
+    </w:p>
+    <w:p>
+      <w:pPr>
+        <w:pStyle w:val="ListParagraph"/>
+        <w:numPr>
           <w:ilvl w:val="0"/>
           <w:numId w:val="2"/>
         </w:numPr>
@@ -102,12 +162,60 @@
       <w:pPr>
         <w:pStyle w:val="ListParagraph"/>
         <w:numPr>
+          <w:ilvl w:val="1"/>
+          <w:numId w:val="2"/>
+        </w:numPr>
+      </w:pPr>
+      <w:r>
+        <w:t>saves changes locally – creates snapshot of project on machine</w:t>
+      </w:r>
+    </w:p>
+    <w:p>
+      <w:pPr>
+        <w:pStyle w:val="ListParagraph"/>
+        <w:numPr>
+          <w:ilvl w:val="1"/>
+          <w:numId w:val="2"/>
+        </w:numPr>
+      </w:pPr>
+      <w:r>
+        <w:t>-m = commit message</w:t>
+      </w:r>
+    </w:p>
+    <w:p>
+      <w:pPr>
+        <w:pStyle w:val="ListParagraph"/>
+        <w:numPr>
           <w:ilvl w:val="0"/>
           <w:numId w:val="2"/>
         </w:numPr>
       </w:pPr>
       <w:r>
         <w:t>git push</w:t>
+      </w:r>
+    </w:p>
+    <w:p>
+      <w:pPr>
+        <w:pStyle w:val="ListParagraph"/>
+        <w:numPr>
+          <w:ilvl w:val="1"/>
+          <w:numId w:val="2"/>
+        </w:numPr>
+      </w:pPr>
+      <w:r>
+        <w:t>sends local commits to remote repo</w:t>
+      </w:r>
+    </w:p>
+    <w:p>
+      <w:pPr>
+        <w:pStyle w:val="ListParagraph"/>
+        <w:numPr>
+          <w:ilvl w:val="1"/>
+          <w:numId w:val="2"/>
+        </w:numPr>
+      </w:pPr>
+      <w:r>
+        <w:t>makes work public / backed up</w:t>
       </w:r>
     </w:p>
     <w:p>
@@ -250,6 +358,7 @@
         <w:ind w:left="720"/>
       </w:pPr>
       <w:r>
+        <w:lastRenderedPageBreak/>
         <w:t xml:space="preserve">&gt; </w:t>
       </w:r>
       <w:r>
@@ -343,7 +452,7 @@
         <w:rFonts w:ascii="Symbol" w:hAnsi="Symbol" w:hint="default"/>
       </w:rPr>
     </w:lvl>
-    <w:lvl w:ilvl="1" w:tplc="04090003" w:tentative="1">
+    <w:lvl w:ilvl="1" w:tplc="04090003">
       <w:start w:val="1"/>
       <w:numFmt w:val="bullet"/>
       <w:lvlText w:val="o"/>
@@ -355,7 +464,7 @@
         <w:rFonts w:ascii="Courier New" w:hAnsi="Courier New" w:cs="Courier New" w:hint="default"/>
       </w:rPr>
     </w:lvl>
-    <w:lvl w:ilvl="2" w:tplc="04090005" w:tentative="1">
+    <w:lvl w:ilvl="2" w:tplc="04090005">
       <w:start w:val="1"/>
       <w:numFmt w:val="bullet"/>
       <w:lvlText w:val=""/>
@@ -1549,6 +1658,7 @@
   <w:style w:type="character" w:default="1" w:styleId="DefaultParagraphFont">
     <w:name w:val="Default Paragraph Font"/>
     <w:uiPriority w:val="1"/>
+    <w:semiHidden/>
     <w:unhideWhenUsed/>
   </w:style>
   <w:style w:type="table" w:default="1" w:styleId="TableNormal">

</xml_diff>

<commit_message>
Update to songs with codex workflows
</commit_message>
<xml_diff>
--- a/Update Workflow.docx
+++ b/Update Workflow.docx
@@ -131,8 +131,13 @@
         </w:numPr>
       </w:pPr>
       <w:r>
-        <w:t>git add .</w:t>
-      </w:r>
+        <w:t xml:space="preserve">git </w:t>
+      </w:r>
+      <w:proofErr w:type="gramStart"/>
+      <w:r>
+        <w:t>add .</w:t>
+      </w:r>
+      <w:proofErr w:type="gramEnd"/>
     </w:p>
     <w:p>
       <w:pPr>
@@ -226,8 +231,21 @@
           <w:numId w:val="2"/>
         </w:numPr>
       </w:pPr>
-      <w:r>
-        <w:t>quarto publish gh-pages</w:t>
+      <w:proofErr w:type="gramStart"/>
+      <w:r>
+        <w:t>quarto</w:t>
+      </w:r>
+      <w:proofErr w:type="gramEnd"/>
+      <w:r>
+        <w:t xml:space="preserve"> publish </w:t>
+      </w:r>
+      <w:proofErr w:type="spellStart"/>
+      <w:r>
+        <w:t>gh</w:t>
+      </w:r>
+      <w:proofErr w:type="spellEnd"/>
+      <w:r>
+        <w:t>-pages</w:t>
       </w:r>
     </w:p>
     <w:p>
@@ -266,8 +284,13 @@
         </w:numPr>
       </w:pPr>
       <w:r>
-        <w:t>git add .</w:t>
-      </w:r>
+        <w:t xml:space="preserve">git </w:t>
+      </w:r>
+      <w:proofErr w:type="gramStart"/>
+      <w:r>
+        <w:t>add .</w:t>
+      </w:r>
+      <w:proofErr w:type="gramEnd"/>
     </w:p>
     <w:p>
       <w:pPr>
@@ -301,15 +324,33 @@
           <w:numId w:val="3"/>
         </w:numPr>
       </w:pPr>
-      <w:r>
-        <w:t>quarto publish gh-pages</w:t>
+      <w:proofErr w:type="gramStart"/>
+      <w:r>
+        <w:t>quarto</w:t>
+      </w:r>
+      <w:proofErr w:type="gramEnd"/>
+      <w:r>
+        <w:t xml:space="preserve"> publish </w:t>
+      </w:r>
+      <w:proofErr w:type="spellStart"/>
+      <w:r>
+        <w:t>gh</w:t>
+      </w:r>
+      <w:proofErr w:type="spellEnd"/>
+      <w:r>
+        <w:t>-pages</w:t>
       </w:r>
     </w:p>
     <w:p/>
     <w:p/>
     <w:p>
-      <w:r>
-        <w:t>So your workflow is:</w:t>
+      <w:proofErr w:type="gramStart"/>
+      <w:r>
+        <w:t>So</w:t>
+      </w:r>
+      <w:proofErr w:type="gramEnd"/>
+      <w:r>
+        <w:t xml:space="preserve"> your workflow is:</w:t>
       </w:r>
     </w:p>
     <w:p>
@@ -320,7 +361,15 @@
         </w:numPr>
       </w:pPr>
       <w:r>
-        <w:t>Add a new file, e.g. songs/new-song.qmd:</w:t>
+        <w:t>Add a new file, e.g. songs/new-</w:t>
+      </w:r>
+      <w:proofErr w:type="spellStart"/>
+      <w:r>
+        <w:t>song.qmd</w:t>
+      </w:r>
+      <w:proofErr w:type="spellEnd"/>
+      <w:r>
+        <w:t>:</w:t>
       </w:r>
     </w:p>
     <w:p>
@@ -361,8 +410,21 @@
         <w:lastRenderedPageBreak/>
         <w:t xml:space="preserve">&gt; </w:t>
       </w:r>
-      <w:r>
-        <w:t>quarto publish gh-pages</w:t>
+      <w:proofErr w:type="gramStart"/>
+      <w:r>
+        <w:t>quarto</w:t>
+      </w:r>
+      <w:proofErr w:type="gramEnd"/>
+      <w:r>
+        <w:t xml:space="preserve"> publish </w:t>
+      </w:r>
+      <w:proofErr w:type="spellStart"/>
+      <w:r>
+        <w:t>gh</w:t>
+      </w:r>
+      <w:proofErr w:type="spellEnd"/>
+      <w:r>
+        <w:t>-pages</w:t>
       </w:r>
     </w:p>
     <w:p>
@@ -421,6 +483,414 @@
       </w:pPr>
       <w:r>
         <w:t>Publish = build + deploy</w:t>
+      </w:r>
+    </w:p>
+    <w:p>
+      <w:r>
+        <w:br w:type="page"/>
+      </w:r>
+    </w:p>
+    <w:p>
+      <w:r>
+        <w:lastRenderedPageBreak/>
+        <w:t xml:space="preserve">I found </w:t>
+      </w:r>
+      <w:r>
+        <w:rPr>
+          <w:b/>
+          <w:bCs/>
+        </w:rPr>
+        <w:t xml:space="preserve">12 songs that are not currently </w:t>
+      </w:r>
+      <w:proofErr w:type="gramStart"/>
+      <w:r>
+        <w:rPr>
+          <w:b/>
+          <w:bCs/>
+        </w:rPr>
+        <w:t>in</w:t>
+      </w:r>
+      <w:proofErr w:type="gramEnd"/>
+      <w:r>
+        <w:rPr>
+          <w:b/>
+          <w:bCs/>
+        </w:rPr>
+        <w:t xml:space="preserve"> your website list</w:t>
+      </w:r>
+      <w:r>
+        <w:t>:</w:t>
+      </w:r>
+    </w:p>
+    <w:p>
+      <w:pPr>
+        <w:numPr>
+          <w:ilvl w:val="0"/>
+          <w:numId w:val="6"/>
+        </w:numPr>
+      </w:pPr>
+      <w:proofErr w:type="spellStart"/>
+      <w:r>
+        <w:rPr>
+          <w:b/>
+          <w:bCs/>
+        </w:rPr>
+        <w:t>Wonderf’lly</w:t>
+      </w:r>
+      <w:proofErr w:type="spellEnd"/>
+      <w:r>
+        <w:t xml:space="preserve"> — </w:t>
+      </w:r>
+      <w:proofErr w:type="spellStart"/>
+      <w:r>
+        <w:t>wonderfully.qmd</w:t>
+      </w:r>
+      <w:proofErr w:type="spellEnd"/>
+      <w:r>
+        <w:t xml:space="preserve"> </w:t>
+      </w:r>
+    </w:p>
+    <w:p>
+      <w:pPr>
+        <w:numPr>
+          <w:ilvl w:val="0"/>
+          <w:numId w:val="6"/>
+        </w:numPr>
+      </w:pPr>
+      <w:r>
+        <w:rPr>
+          <w:b/>
+          <w:bCs/>
+        </w:rPr>
+        <w:t>In the Beginning God</w:t>
+      </w:r>
+      <w:r>
+        <w:t xml:space="preserve"> — in-the-beginning-</w:t>
+      </w:r>
+      <w:proofErr w:type="spellStart"/>
+      <w:r>
+        <w:t>god.qmd</w:t>
+      </w:r>
+      <w:proofErr w:type="spellEnd"/>
+      <w:r>
+        <w:t xml:space="preserve"> </w:t>
+      </w:r>
+    </w:p>
+    <w:p>
+      <w:pPr>
+        <w:numPr>
+          <w:ilvl w:val="0"/>
+          <w:numId w:val="6"/>
+        </w:numPr>
+      </w:pPr>
+      <w:r>
+        <w:rPr>
+          <w:b/>
+          <w:bCs/>
+        </w:rPr>
+        <w:t>Adam and God</w:t>
+      </w:r>
+      <w:r>
+        <w:t xml:space="preserve"> — </w:t>
+      </w:r>
+      <w:proofErr w:type="spellStart"/>
+      <w:r>
+        <w:t>adam</w:t>
+      </w:r>
+      <w:proofErr w:type="spellEnd"/>
+      <w:r>
+        <w:t>-and-</w:t>
+      </w:r>
+      <w:proofErr w:type="spellStart"/>
+      <w:r>
+        <w:t>god.qmd</w:t>
+      </w:r>
+      <w:proofErr w:type="spellEnd"/>
+      <w:r>
+        <w:t xml:space="preserve"> </w:t>
+      </w:r>
+    </w:p>
+    <w:p>
+      <w:pPr>
+        <w:numPr>
+          <w:ilvl w:val="0"/>
+          <w:numId w:val="6"/>
+        </w:numPr>
+      </w:pPr>
+      <w:r>
+        <w:rPr>
+          <w:b/>
+          <w:bCs/>
+        </w:rPr>
+        <w:t>I Want to Thank God for Making Me</w:t>
+      </w:r>
+      <w:r>
+        <w:t xml:space="preserve"> — </w:t>
+      </w:r>
+      <w:proofErr w:type="spellStart"/>
+      <w:r>
+        <w:t>i</w:t>
+      </w:r>
+      <w:proofErr w:type="spellEnd"/>
+      <w:r>
+        <w:t>-want-to-thank-</w:t>
+      </w:r>
+      <w:proofErr w:type="spellStart"/>
+      <w:r>
+        <w:t>god.qmd</w:t>
+      </w:r>
+      <w:proofErr w:type="spellEnd"/>
+      <w:r>
+        <w:t xml:space="preserve"> </w:t>
+      </w:r>
+    </w:p>
+    <w:p>
+      <w:pPr>
+        <w:numPr>
+          <w:ilvl w:val="0"/>
+          <w:numId w:val="6"/>
+        </w:numPr>
+      </w:pPr>
+      <w:r>
+        <w:rPr>
+          <w:b/>
+          <w:bCs/>
+        </w:rPr>
+        <w:t>O I’m a Man</w:t>
+      </w:r>
+      <w:r>
+        <w:t xml:space="preserve"> — o-im-a-</w:t>
+      </w:r>
+      <w:proofErr w:type="spellStart"/>
+      <w:r>
+        <w:t>man.qmd</w:t>
+      </w:r>
+      <w:proofErr w:type="spellEnd"/>
+      <w:r>
+        <w:t xml:space="preserve"> </w:t>
+      </w:r>
+    </w:p>
+    <w:p>
+      <w:pPr>
+        <w:numPr>
+          <w:ilvl w:val="0"/>
+          <w:numId w:val="6"/>
+        </w:numPr>
+      </w:pPr>
+      <w:r>
+        <w:rPr>
+          <w:b/>
+          <w:bCs/>
+        </w:rPr>
+        <w:t>God Has Chosen Us</w:t>
+      </w:r>
+      <w:r>
+        <w:t xml:space="preserve"> — god-has-chosen-</w:t>
+      </w:r>
+      <w:proofErr w:type="spellStart"/>
+      <w:r>
+        <w:t>us.qmd</w:t>
+      </w:r>
+      <w:proofErr w:type="spellEnd"/>
+      <w:r>
+        <w:t xml:space="preserve"> </w:t>
+      </w:r>
+    </w:p>
+    <w:p>
+      <w:pPr>
+        <w:numPr>
+          <w:ilvl w:val="0"/>
+          <w:numId w:val="6"/>
+        </w:numPr>
+      </w:pPr>
+      <w:r>
+        <w:rPr>
+          <w:b/>
+          <w:bCs/>
+        </w:rPr>
+        <w:t xml:space="preserve">Honor and </w:t>
+      </w:r>
+      <w:proofErr w:type="gramStart"/>
+      <w:r>
+        <w:rPr>
+          <w:b/>
+          <w:bCs/>
+        </w:rPr>
+        <w:t>Obey</w:t>
+      </w:r>
+      <w:proofErr w:type="gramEnd"/>
+      <w:r>
+        <w:t xml:space="preserve"> — honor-and-</w:t>
+      </w:r>
+      <w:proofErr w:type="spellStart"/>
+      <w:r>
+        <w:t>obey.qmd</w:t>
+      </w:r>
+      <w:proofErr w:type="spellEnd"/>
+      <w:r>
+        <w:t xml:space="preserve"> </w:t>
+      </w:r>
+    </w:p>
+    <w:p>
+      <w:pPr>
+        <w:numPr>
+          <w:ilvl w:val="0"/>
+          <w:numId w:val="6"/>
+        </w:numPr>
+      </w:pPr>
+      <w:r>
+        <w:rPr>
+          <w:b/>
+          <w:bCs/>
+        </w:rPr>
+        <w:t>We Know, We Know</w:t>
+      </w:r>
+      <w:r>
+        <w:t xml:space="preserve"> — we-know-we-</w:t>
+      </w:r>
+      <w:proofErr w:type="spellStart"/>
+      <w:r>
+        <w:t>know.qmd</w:t>
+      </w:r>
+      <w:proofErr w:type="spellEnd"/>
+      <w:r>
+        <w:t xml:space="preserve"> </w:t>
+      </w:r>
+    </w:p>
+    <w:p>
+      <w:pPr>
+        <w:numPr>
+          <w:ilvl w:val="0"/>
+          <w:numId w:val="6"/>
+        </w:numPr>
+      </w:pPr>
+      <w:r>
+        <w:rPr>
+          <w:b/>
+          <w:bCs/>
+        </w:rPr>
+        <w:t>You Dear Children</w:t>
+      </w:r>
+      <w:r>
+        <w:t xml:space="preserve"> — you-dear-</w:t>
+      </w:r>
+      <w:proofErr w:type="spellStart"/>
+      <w:r>
+        <w:t>children.qmd</w:t>
+      </w:r>
+      <w:proofErr w:type="spellEnd"/>
+      <w:r>
+        <w:t xml:space="preserve"> </w:t>
+      </w:r>
+    </w:p>
+    <w:p>
+      <w:pPr>
+        <w:numPr>
+          <w:ilvl w:val="0"/>
+          <w:numId w:val="6"/>
+        </w:numPr>
+      </w:pPr>
+      <w:r>
+        <w:rPr>
+          <w:b/>
+          <w:bCs/>
+        </w:rPr>
+        <w:t>Channel of Blessing</w:t>
+      </w:r>
+      <w:r>
+        <w:t xml:space="preserve"> — channel-of-</w:t>
+      </w:r>
+      <w:proofErr w:type="spellStart"/>
+      <w:r>
+        <w:t>blessing.qmd</w:t>
+      </w:r>
+      <w:proofErr w:type="spellEnd"/>
+      <w:r>
+        <w:t xml:space="preserve"> </w:t>
+      </w:r>
+    </w:p>
+    <w:p>
+      <w:pPr>
+        <w:numPr>
+          <w:ilvl w:val="0"/>
+          <w:numId w:val="6"/>
+        </w:numPr>
+      </w:pPr>
+      <w:r>
+        <w:rPr>
+          <w:b/>
+          <w:bCs/>
+        </w:rPr>
+        <w:t xml:space="preserve">When I Grow </w:t>
+      </w:r>
+      <w:proofErr w:type="gramStart"/>
+      <w:r>
+        <w:rPr>
+          <w:b/>
+          <w:bCs/>
+        </w:rPr>
+        <w:t>Up</w:t>
+      </w:r>
+      <w:proofErr w:type="gramEnd"/>
+      <w:r>
+        <w:rPr>
+          <w:b/>
+          <w:bCs/>
+        </w:rPr>
+        <w:t xml:space="preserve"> I Want to Be a Man of God</w:t>
+      </w:r>
+      <w:r>
+        <w:t xml:space="preserve"> — when-</w:t>
+      </w:r>
+      <w:proofErr w:type="spellStart"/>
+      <w:r>
+        <w:t>i</w:t>
+      </w:r>
+      <w:proofErr w:type="spellEnd"/>
+      <w:r>
+        <w:t>-grow-</w:t>
+      </w:r>
+      <w:proofErr w:type="spellStart"/>
+      <w:r>
+        <w:t>up.qmd</w:t>
+      </w:r>
+      <w:proofErr w:type="spellEnd"/>
+      <w:r>
+        <w:t xml:space="preserve"> </w:t>
+      </w:r>
+    </w:p>
+    <w:p>
+      <w:pPr>
+        <w:numPr>
+          <w:ilvl w:val="0"/>
+          <w:numId w:val="6"/>
+        </w:numPr>
+      </w:pPr>
+      <w:r>
+        <w:rPr>
+          <w:b/>
+          <w:bCs/>
+        </w:rPr>
+        <w:t>I Keep Falling in Love with Him</w:t>
+      </w:r>
+      <w:r>
+        <w:t xml:space="preserve"> — </w:t>
+      </w:r>
+      <w:proofErr w:type="spellStart"/>
+      <w:r>
+        <w:t>i</w:t>
+      </w:r>
+      <w:proofErr w:type="spellEnd"/>
+      <w:r>
+        <w:t>-keep-falling-in-</w:t>
+      </w:r>
+      <w:proofErr w:type="spellStart"/>
+      <w:r>
+        <w:t>love.qmd</w:t>
+      </w:r>
+      <w:proofErr w:type="spellEnd"/>
+      <w:r>
+        <w:t xml:space="preserve"> </w:t>
       </w:r>
     </w:p>
     <w:p/>
@@ -437,6 +907,119 @@
 <file path=word/numbering.xml><?xml version="1.0" encoding="utf-8"?>
 <w:numbering xmlns:wpc="http://schemas.microsoft.com/office/word/2010/wordprocessingCanvas" xmlns:cx="http://schemas.microsoft.com/office/drawing/2014/chartex" xmlns:cx1="http://schemas.microsoft.com/office/drawing/2015/9/8/chartex" xmlns:cx2="http://schemas.microsoft.com/office/drawing/2015/10/21/chartex" xmlns:cx3="http://schemas.microsoft.com/office/drawing/2016/5/9/chartex" xmlns:cx4="http://schemas.microsoft.com/office/drawing/2016/5/10/chartex" xmlns:cx5="http://schemas.microsoft.com/office/drawing/2016/5/11/chartex" xmlns:cx6="http://schemas.microsoft.com/office/drawing/2016/5/12/chartex" xmlns:cx7="http://schemas.microsoft.com/office/drawing/2016/5/13/chartex" xmlns:cx8="http://schemas.microsoft.com/office/drawing/2016/5/14/chartex" xmlns:mc="http://schemas.openxmlformats.org/markup-compatibility/2006" xmlns:aink="http://schemas.microsoft.com/office/drawing/2016/ink" xmlns:am3d="http://schemas.microsoft.com/office/drawing/2017/model3d" xmlns:o="urn:schemas-microsoft-com:office:office" xmlns:oel="http://schemas.microsoft.com/office/2019/extlst" xmlns:r="http://schemas.openxmlformats.org/officeDocument/2006/relationships" xmlns:m="http://schemas.openxmlformats.org/officeDocument/2006/math" xmlns:v="urn:schemas-microsoft-com:vml" xmlns:wp14="http://schemas.microsoft.com/office/word/2010/wordprocessingDrawing" xmlns:wp="http://schemas.openxmlformats.org/drawingml/2006/wordprocessingDrawing" xmlns:w10="urn:schemas-microsoft-com:office:word" xmlns:w="http://schemas.openxmlformats.org/wordprocessingml/2006/main" xmlns:w14="http://schemas.microsoft.com/office/word/2010/wordml" xmlns:w15="http://schemas.microsoft.com/office/word/2012/wordml" xmlns:w16cex="http://schemas.microsoft.com/office/word/2018/wordml/cex" xmlns:w16cid="http://schemas.microsoft.com/office/word/2016/wordml/cid" xmlns:w16="http://schemas.microsoft.com/office/word/2018/wordml" xmlns:w16du="http://schemas.microsoft.com/office/word/2023/wordml/word16du" xmlns:w16sdtdh="http://schemas.microsoft.com/office/word/2020/wordml/sdtdatahash" xmlns:w16sdtfl="http://schemas.microsoft.com/office/word/2024/wordml/sdtformatlock" xmlns:w16se="http://schemas.microsoft.com/office/word/2015/wordml/symex" xmlns:wpg="http://schemas.microsoft.com/office/word/2010/wordprocessingGroup" xmlns:wpi="http://schemas.microsoft.com/office/word/2010/wordprocessingInk" xmlns:wne="http://schemas.microsoft.com/office/word/2006/wordml" xmlns:wps="http://schemas.microsoft.com/office/word/2010/wordprocessingShape" mc:Ignorable="w14 w15 w16se w16cid w16 w16cex w16sdtdh w16sdtfl w16du wp14">
   <w:abstractNum w:abstractNumId="0" w15:restartNumberingAfterBreak="0">
+    <w:nsid w:val="1BDD333E"/>
+    <w:multiLevelType w:val="multilevel"/>
+    <w:tmpl w:val="40D0EA68"/>
+    <w:lvl w:ilvl="0">
+      <w:start w:val="1"/>
+      <w:numFmt w:val="decimal"/>
+      <w:lvlText w:val="%1."/>
+      <w:lvlJc w:val="left"/>
+      <w:pPr>
+        <w:tabs>
+          <w:tab w:val="num" w:pos="720"/>
+        </w:tabs>
+        <w:ind w:left="720" w:hanging="360"/>
+      </w:pPr>
+    </w:lvl>
+    <w:lvl w:ilvl="1" w:tentative="1">
+      <w:start w:val="1"/>
+      <w:numFmt w:val="decimal"/>
+      <w:lvlText w:val="%2."/>
+      <w:lvlJc w:val="left"/>
+      <w:pPr>
+        <w:tabs>
+          <w:tab w:val="num" w:pos="1440"/>
+        </w:tabs>
+        <w:ind w:left="1440" w:hanging="360"/>
+      </w:pPr>
+    </w:lvl>
+    <w:lvl w:ilvl="2" w:tentative="1">
+      <w:start w:val="1"/>
+      <w:numFmt w:val="decimal"/>
+      <w:lvlText w:val="%3."/>
+      <w:lvlJc w:val="left"/>
+      <w:pPr>
+        <w:tabs>
+          <w:tab w:val="num" w:pos="2160"/>
+        </w:tabs>
+        <w:ind w:left="2160" w:hanging="360"/>
+      </w:pPr>
+    </w:lvl>
+    <w:lvl w:ilvl="3" w:tentative="1">
+      <w:start w:val="1"/>
+      <w:numFmt w:val="decimal"/>
+      <w:lvlText w:val="%4."/>
+      <w:lvlJc w:val="left"/>
+      <w:pPr>
+        <w:tabs>
+          <w:tab w:val="num" w:pos="2880"/>
+        </w:tabs>
+        <w:ind w:left="2880" w:hanging="360"/>
+      </w:pPr>
+    </w:lvl>
+    <w:lvl w:ilvl="4" w:tentative="1">
+      <w:start w:val="1"/>
+      <w:numFmt w:val="decimal"/>
+      <w:lvlText w:val="%5."/>
+      <w:lvlJc w:val="left"/>
+      <w:pPr>
+        <w:tabs>
+          <w:tab w:val="num" w:pos="3600"/>
+        </w:tabs>
+        <w:ind w:left="3600" w:hanging="360"/>
+      </w:pPr>
+    </w:lvl>
+    <w:lvl w:ilvl="5" w:tentative="1">
+      <w:start w:val="1"/>
+      <w:numFmt w:val="decimal"/>
+      <w:lvlText w:val="%6."/>
+      <w:lvlJc w:val="left"/>
+      <w:pPr>
+        <w:tabs>
+          <w:tab w:val="num" w:pos="4320"/>
+        </w:tabs>
+        <w:ind w:left="4320" w:hanging="360"/>
+      </w:pPr>
+    </w:lvl>
+    <w:lvl w:ilvl="6" w:tentative="1">
+      <w:start w:val="1"/>
+      <w:numFmt w:val="decimal"/>
+      <w:lvlText w:val="%7."/>
+      <w:lvlJc w:val="left"/>
+      <w:pPr>
+        <w:tabs>
+          <w:tab w:val="num" w:pos="5040"/>
+        </w:tabs>
+        <w:ind w:left="5040" w:hanging="360"/>
+      </w:pPr>
+    </w:lvl>
+    <w:lvl w:ilvl="7" w:tentative="1">
+      <w:start w:val="1"/>
+      <w:numFmt w:val="decimal"/>
+      <w:lvlText w:val="%8."/>
+      <w:lvlJc w:val="left"/>
+      <w:pPr>
+        <w:tabs>
+          <w:tab w:val="num" w:pos="5760"/>
+        </w:tabs>
+        <w:ind w:left="5760" w:hanging="360"/>
+      </w:pPr>
+    </w:lvl>
+    <w:lvl w:ilvl="8" w:tentative="1">
+      <w:start w:val="1"/>
+      <w:numFmt w:val="decimal"/>
+      <w:lvlText w:val="%9."/>
+      <w:lvlJc w:val="left"/>
+      <w:pPr>
+        <w:tabs>
+          <w:tab w:val="num" w:pos="6480"/>
+        </w:tabs>
+        <w:ind w:left="6480" w:hanging="360"/>
+      </w:pPr>
+    </w:lvl>
+  </w:abstractNum>
+  <w:abstractNum w:abstractNumId="1" w15:restartNumberingAfterBreak="0">
     <w:nsid w:val="1D980470"/>
     <w:multiLevelType w:val="hybridMultilevel"/>
     <w:tmpl w:val="F42823D0"/>
@@ -549,7 +1132,7 @@
       </w:rPr>
     </w:lvl>
   </w:abstractNum>
-  <w:abstractNum w:abstractNumId="1" w15:restartNumberingAfterBreak="0">
+  <w:abstractNum w:abstractNumId="2" w15:restartNumberingAfterBreak="0">
     <w:nsid w:val="22500FB5"/>
     <w:multiLevelType w:val="hybridMultilevel"/>
     <w:tmpl w:val="7AE41DD6"/>
@@ -662,7 +1245,7 @@
       </w:rPr>
     </w:lvl>
   </w:abstractNum>
-  <w:abstractNum w:abstractNumId="2" w15:restartNumberingAfterBreak="0">
+  <w:abstractNum w:abstractNumId="3" w15:restartNumberingAfterBreak="0">
     <w:nsid w:val="26525CA5"/>
     <w:multiLevelType w:val="multilevel"/>
     <w:tmpl w:val="DA40446C"/>
@@ -775,7 +1358,7 @@
       </w:pPr>
     </w:lvl>
   </w:abstractNum>
-  <w:abstractNum w:abstractNumId="3" w15:restartNumberingAfterBreak="0">
+  <w:abstractNum w:abstractNumId="4" w15:restartNumberingAfterBreak="0">
     <w:nsid w:val="5B730E04"/>
     <w:multiLevelType w:val="multilevel"/>
     <w:tmpl w:val="C50AAFA4"/>
@@ -924,7 +1507,7 @@
       </w:rPr>
     </w:lvl>
   </w:abstractNum>
-  <w:abstractNum w:abstractNumId="4" w15:restartNumberingAfterBreak="0">
+  <w:abstractNum w:abstractNumId="5" w15:restartNumberingAfterBreak="0">
     <w:nsid w:val="74855B90"/>
     <w:multiLevelType w:val="hybridMultilevel"/>
     <w:tmpl w:val="C9683220"/>
@@ -1038,19 +1621,22 @@
     </w:lvl>
   </w:abstractNum>
   <w:num w:numId="1" w16cid:durableId="704208812">
+    <w:abstractNumId w:val="3"/>
+  </w:num>
+  <w:num w:numId="2" w16cid:durableId="1525443127">
+    <w:abstractNumId w:val="1"/>
+  </w:num>
+  <w:num w:numId="3" w16cid:durableId="1501579225">
     <w:abstractNumId w:val="2"/>
   </w:num>
-  <w:num w:numId="2" w16cid:durableId="1525443127">
-    <w:abstractNumId w:val="0"/>
-  </w:num>
-  <w:num w:numId="3" w16cid:durableId="1501579225">
-    <w:abstractNumId w:val="1"/>
-  </w:num>
   <w:num w:numId="4" w16cid:durableId="1313947641">
-    <w:abstractNumId w:val="3"/>
+    <w:abstractNumId w:val="4"/>
   </w:num>
   <w:num w:numId="5" w16cid:durableId="1398162308">
-    <w:abstractNumId w:val="4"/>
+    <w:abstractNumId w:val="5"/>
+  </w:num>
+  <w:num w:numId="6" w16cid:durableId="460995641">
+    <w:abstractNumId w:val="0"/>
   </w:num>
 </w:numbering>
 </file>
@@ -1658,7 +2244,6 @@
   <w:style w:type="character" w:default="1" w:styleId="DefaultParagraphFont">
     <w:name w:val="Default Paragraph Font"/>
     <w:uiPriority w:val="1"/>
-    <w:semiHidden/>
     <w:unhideWhenUsed/>
   </w:style>
   <w:style w:type="table" w:default="1" w:styleId="TableNormal">

</xml_diff>